<commit_message>
Include x64 CI costs and architecture-specific Actions savings in Word report
Co-authored-by: Copilot <223556219+Copilot@users.noreply.github.com>
</commit_message>
<xml_diff>
--- a/ci-benchmark/Windows-Rust-Performance-Summary.docx
+++ b/ci-benchmark/Windows-Rust-Performance-Summary.docx
@@ -24,7 +24,7 @@
           <w:b w:val="0"/>
           <w:sz w:val="18"/>
         </w:rPr>
-        <w:t>Consolidated investigation report | 2 October 2026 | Measured Rust 1.94.1</w:t>
+        <w:t>Consolidated investigation report | Updated 7 October 2026 | Measured Rust 1.94.1</w:t>
       </w:r>
     </w:p>
     <w:p>
@@ -1599,7 +1599,7 @@
         <w:rPr>
           <w:b w:val="0"/>
         </w:rPr>
-        <w:t>The least complex candidate is a larger native runner, with ThinLTO reserved for the final shipping compiler rather than every temporary training build. The model projects 182 minutes on 16 vCPUs versus 136 minutes on 32 vCPUs. Four smaller parallel jobs project about 386 minutes elapsed and 475 summed, rounded runner-minutes; they avoid long individual jobs but add transfers, provenance and orchestration. On 32 vCPUs, four jobs project 157 minutes/200 rounded runner-minutes, worse than one job. Two sequential profile-generation/distribution jobs are the simpler fallback. All are unvalidated projections, not linear core-scaling promises. [4]</w:t>
+        <w:t>The least complex candidate is a larger native runner, with ThinLTO reserved for the final shipping compiler rather than every temporary training build. The Arm64 model projects 182 minutes on 16 vCPUs versus 136 minutes on 32 vCPUs. Four smaller parallel jobs project about 386 minutes elapsed and 475 summed, rounded runner-minutes; they avoid long individual jobs but add transfers, provenance and orchestration. On 32 vCPUs, four jobs project 157 minutes/200 rounded runner-minutes, worse than one job. Two sequential profile-generation/distribution jobs are the simpler fallback. All are unvalidated projections, not linear core-scaling promises. [4]</w:t>
       </w:r>
     </w:p>
     <w:p>
@@ -1615,15 +1615,409 @@
         <w:rPr>
           <w:b w:val="0"/>
         </w:rPr>
-        <w:t>The measured downstream gains justify further qualification. To approach today's two-hour distribution time with minimal CI changes, the recommended approach needs a larger native Windows Arm64 runner: 32 vCPUs, 128 GB RAM and 1.2 TB SSD, with overflow/replacement capacity. The quoted rate is $0.098 per active minute: about $13.33 per modeled 136-minute attempt, or $13.68 per qualified build under the proposal's explicit retry assumptions. This is a hosted-runner proposal, not a self-hosted hardware quote or guaranteed 32-physical-core machine. [4, 5]</w:t>
+        <w:t>Recommend qualifying a native Windows Arm64 32-vCPU runner (128 GB RAM, 1.2 TB SSD), with overflow capacity, to approach today's two-hour distribution time. Below are GitHub-hosted Windows compute budgets for each architecture, not physical-machine purchase quotes. [4, 5]</w:t>
+      </w:r>
+    </w:p>
+    <w:tbl>
+      <w:tblPr>
+        <w:tblStyle w:val="TableGrid"/>
+        <w:tblW w:type="auto" w:w="0"/>
+        <w:jc w:val="center"/>
+        <w:tblLayout w:type="fixed"/>
+        <w:tblLook w:firstColumn="1" w:firstRow="1" w:lastColumn="0" w:lastRow="0" w:noHBand="0" w:noVBand="1" w:val="04A0"/>
+      </w:tblPr>
+      <w:tblGrid>
+        <w:gridCol w:w="1673"/>
+        <w:gridCol w:w="1673"/>
+        <w:gridCol w:w="1673"/>
+        <w:gridCol w:w="1673"/>
+        <w:gridCol w:w="1673"/>
+        <w:gridCol w:w="1673"/>
+      </w:tblGrid>
+      <w:tr>
+        <w:trPr>
+          <w:tblHeader/>
+          <w:cantSplit/>
+        </w:trPr>
+        <w:tc>
+          <w:tcPr>
+            <w:tcW w:type="dxa" w:w="1469"/>
+            <w:shd w:fill="17365D"/>
+            <w:vAlign w:val="center"/>
+          </w:tcPr>
+          <w:p>
+            <w:pPr>
+              <w:spacing w:before="60" w:after="60" w:line="240" w:lineRule="auto"/>
+            </w:pPr>
+            <w:r>
+              <w:rPr>
+                <w:b/>
+                <w:color w:val="FFFFFF"/>
+                <w:sz w:val="19"/>
+              </w:rPr>
+              <w:t>Runner</w:t>
+            </w:r>
+          </w:p>
+        </w:tc>
+        <w:tc>
+          <w:tcPr>
+            <w:tcW w:type="dxa" w:w="1469"/>
+            <w:shd w:fill="17365D"/>
+            <w:vAlign w:val="center"/>
+          </w:tcPr>
+          <w:p>
+            <w:pPr>
+              <w:spacing w:before="60" w:after="60" w:line="240" w:lineRule="auto"/>
+              <w:jc w:val="center"/>
+            </w:pPr>
+            <w:r>
+              <w:rPr>
+                <w:b/>
+                <w:color w:val="FFFFFF"/>
+                <w:sz w:val="19"/>
+              </w:rPr>
+              <w:t>x64 $/min</w:t>
+            </w:r>
+          </w:p>
+        </w:tc>
+        <w:tc>
+          <w:tcPr>
+            <w:tcW w:type="dxa" w:w="1613"/>
+            <w:shd w:fill="17365D"/>
+            <w:vAlign w:val="center"/>
+          </w:tcPr>
+          <w:p>
+            <w:pPr>
+              <w:spacing w:before="60" w:after="60" w:line="240" w:lineRule="auto"/>
+              <w:jc w:val="center"/>
+            </w:pPr>
+            <w:r>
+              <w:rPr>
+                <w:b/>
+                <w:color w:val="FFFFFF"/>
+                <w:sz w:val="19"/>
+              </w:rPr>
+              <w:t>Arm64 $/min</w:t>
+            </w:r>
+          </w:p>
+        </w:tc>
+        <w:tc>
+          <w:tcPr>
+            <w:tcW w:type="dxa" w:w="1858"/>
+            <w:shd w:fill="17365D"/>
+            <w:vAlign w:val="center"/>
+          </w:tcPr>
+          <w:p>
+            <w:pPr>
+              <w:spacing w:before="60" w:after="60" w:line="240" w:lineRule="auto"/>
+              <w:jc w:val="center"/>
+            </w:pPr>
+            <w:r>
+              <w:rPr>
+                <w:b/>
+                <w:color w:val="FFFFFF"/>
+                <w:sz w:val="19"/>
+              </w:rPr>
+              <w:t>Billed min/build</w:t>
+            </w:r>
+          </w:p>
+        </w:tc>
+        <w:tc>
+          <w:tcPr>
+            <w:tcW w:type="dxa" w:w="1814"/>
+            <w:shd w:fill="17365D"/>
+            <w:vAlign w:val="center"/>
+          </w:tcPr>
+          <w:p>
+            <w:pPr>
+              <w:spacing w:before="60" w:after="60" w:line="240" w:lineRule="auto"/>
+              <w:jc w:val="center"/>
+            </w:pPr>
+            <w:r>
+              <w:rPr>
+                <w:b/>
+                <w:color w:val="FFFFFF"/>
+                <w:sz w:val="19"/>
+              </w:rPr>
+              <w:t>x64 $/year</w:t>
+            </w:r>
+          </w:p>
+        </w:tc>
+        <w:tc>
+          <w:tcPr>
+            <w:tcW w:type="dxa" w:w="1814"/>
+            <w:shd w:fill="17365D"/>
+            <w:vAlign w:val="center"/>
+          </w:tcPr>
+          <w:p>
+            <w:pPr>
+              <w:spacing w:before="60" w:after="60" w:line="240" w:lineRule="auto"/>
+              <w:jc w:val="center"/>
+            </w:pPr>
+            <w:r>
+              <w:rPr>
+                <w:b/>
+                <w:color w:val="FFFFFF"/>
+                <w:sz w:val="19"/>
+              </w:rPr>
+              <w:t>Arm64 $/year</w:t>
+            </w:r>
+          </w:p>
+        </w:tc>
+      </w:tr>
+      <w:tr>
+        <w:trPr>
+          <w:cantSplit/>
+        </w:trPr>
+        <w:tc>
+          <w:tcPr>
+            <w:tcW w:type="dxa" w:w="1469"/>
+            <w:shd w:fill="EEF3F8"/>
+            <w:vAlign w:val="center"/>
+          </w:tcPr>
+          <w:p>
+            <w:pPr>
+              <w:spacing w:before="60" w:after="60" w:line="240" w:lineRule="auto"/>
+            </w:pPr>
+            <w:r>
+              <w:rPr>
+                <w:sz w:val="19"/>
+              </w:rPr>
+              <w:t>16 vCPU</w:t>
+            </w:r>
+          </w:p>
+        </w:tc>
+        <w:tc>
+          <w:tcPr>
+            <w:tcW w:type="dxa" w:w="1469"/>
+            <w:shd w:fill="EEF3F8"/>
+            <w:vAlign w:val="center"/>
+          </w:tcPr>
+          <w:p>
+            <w:pPr>
+              <w:spacing w:before="60" w:after="60" w:line="240" w:lineRule="auto"/>
+              <w:jc w:val="center"/>
+            </w:pPr>
+            <w:r>
+              <w:rPr>
+                <w:sz w:val="19"/>
+              </w:rPr>
+              <w:t>$0.082</w:t>
+            </w:r>
+          </w:p>
+        </w:tc>
+        <w:tc>
+          <w:tcPr>
+            <w:tcW w:type="dxa" w:w="1613"/>
+            <w:shd w:fill="EEF3F8"/>
+            <w:vAlign w:val="center"/>
+          </w:tcPr>
+          <w:p>
+            <w:pPr>
+              <w:spacing w:before="60" w:after="60" w:line="240" w:lineRule="auto"/>
+              <w:jc w:val="center"/>
+            </w:pPr>
+            <w:r>
+              <w:rPr>
+                <w:sz w:val="19"/>
+              </w:rPr>
+              <w:t>$0.050</w:t>
+            </w:r>
+          </w:p>
+        </w:tc>
+        <w:tc>
+          <w:tcPr>
+            <w:tcW w:type="dxa" w:w="1858"/>
+            <w:shd w:fill="EEF3F8"/>
+            <w:vAlign w:val="center"/>
+          </w:tcPr>
+          <w:p>
+            <w:pPr>
+              <w:spacing w:before="60" w:after="60" w:line="240" w:lineRule="auto"/>
+              <w:jc w:val="center"/>
+            </w:pPr>
+            <w:r>
+              <w:rPr>
+                <w:sz w:val="19"/>
+              </w:rPr>
+              <w:t>183</w:t>
+            </w:r>
+          </w:p>
+        </w:tc>
+        <w:tc>
+          <w:tcPr>
+            <w:tcW w:type="dxa" w:w="1814"/>
+            <w:shd w:fill="EEF3F8"/>
+            <w:vAlign w:val="center"/>
+          </w:tcPr>
+          <w:p>
+            <w:pPr>
+              <w:spacing w:before="60" w:after="60" w:line="240" w:lineRule="auto"/>
+              <w:jc w:val="center"/>
+            </w:pPr>
+            <w:r>
+              <w:rPr>
+                <w:sz w:val="19"/>
+              </w:rPr>
+              <w:t>$63,385</w:t>
+            </w:r>
+          </w:p>
+        </w:tc>
+        <w:tc>
+          <w:tcPr>
+            <w:tcW w:type="dxa" w:w="1814"/>
+            <w:shd w:fill="EEF3F8"/>
+            <w:vAlign w:val="center"/>
+          </w:tcPr>
+          <w:p>
+            <w:pPr>
+              <w:spacing w:before="60" w:after="60" w:line="240" w:lineRule="auto"/>
+              <w:jc w:val="center"/>
+            </w:pPr>
+            <w:r>
+              <w:rPr>
+                <w:sz w:val="19"/>
+              </w:rPr>
+              <w:t>$38,650</w:t>
+            </w:r>
+          </w:p>
+        </w:tc>
+      </w:tr>
+      <w:tr>
+        <w:trPr>
+          <w:cantSplit/>
+        </w:trPr>
+        <w:tc>
+          <w:tcPr>
+            <w:tcW w:type="dxa" w:w="1469"/>
+            <w:vAlign w:val="center"/>
+          </w:tcPr>
+          <w:p>
+            <w:pPr>
+              <w:spacing w:before="60" w:after="60" w:line="240" w:lineRule="auto"/>
+            </w:pPr>
+            <w:r>
+              <w:rPr>
+                <w:sz w:val="19"/>
+              </w:rPr>
+              <w:t>32 vCPU</w:t>
+            </w:r>
+          </w:p>
+        </w:tc>
+        <w:tc>
+          <w:tcPr>
+            <w:tcW w:type="dxa" w:w="1469"/>
+            <w:vAlign w:val="center"/>
+          </w:tcPr>
+          <w:p>
+            <w:pPr>
+              <w:spacing w:before="60" w:after="60" w:line="240" w:lineRule="auto"/>
+              <w:jc w:val="center"/>
+            </w:pPr>
+            <w:r>
+              <w:rPr>
+                <w:sz w:val="19"/>
+              </w:rPr>
+              <w:t>$0.162</w:t>
+            </w:r>
+          </w:p>
+        </w:tc>
+        <w:tc>
+          <w:tcPr>
+            <w:tcW w:type="dxa" w:w="1613"/>
+            <w:vAlign w:val="center"/>
+          </w:tcPr>
+          <w:p>
+            <w:pPr>
+              <w:spacing w:before="60" w:after="60" w:line="240" w:lineRule="auto"/>
+              <w:jc w:val="center"/>
+            </w:pPr>
+            <w:r>
+              <w:rPr>
+                <w:sz w:val="19"/>
+              </w:rPr>
+              <w:t>$0.098</w:t>
+            </w:r>
+          </w:p>
+        </w:tc>
+        <w:tc>
+          <w:tcPr>
+            <w:tcW w:type="dxa" w:w="1858"/>
+            <w:vAlign w:val="center"/>
+          </w:tcPr>
+          <w:p>
+            <w:pPr>
+              <w:spacing w:before="60" w:after="60" w:line="240" w:lineRule="auto"/>
+              <w:jc w:val="center"/>
+            </w:pPr>
+            <w:r>
+              <w:rPr>
+                <w:sz w:val="19"/>
+              </w:rPr>
+              <w:t>136</w:t>
+            </w:r>
+          </w:p>
+        </w:tc>
+        <w:tc>
+          <w:tcPr>
+            <w:tcW w:type="dxa" w:w="1814"/>
+            <w:vAlign w:val="center"/>
+          </w:tcPr>
+          <w:p>
+            <w:pPr>
+              <w:spacing w:before="60" w:after="60" w:line="240" w:lineRule="auto"/>
+              <w:jc w:val="center"/>
+            </w:pPr>
+            <w:r>
+              <w:rPr>
+                <w:sz w:val="19"/>
+              </w:rPr>
+              <w:t>$93,063</w:t>
+            </w:r>
+          </w:p>
+        </w:tc>
+        <w:tc>
+          <w:tcPr>
+            <w:tcW w:type="dxa" w:w="1814"/>
+            <w:vAlign w:val="center"/>
+          </w:tcPr>
+          <w:p>
+            <w:pPr>
+              <w:spacing w:before="60" w:after="60" w:line="240" w:lineRule="auto"/>
+              <w:jc w:val="center"/>
+            </w:pPr>
+            <w:r>
+              <w:rPr>
+                <w:sz w:val="19"/>
+              </w:rPr>
+              <w:t>$56,297</w:t>
+            </w:r>
+          </w:p>
+        </w:tc>
+      </w:tr>
+    </w:tbl>
+    <w:p>
+      <w:pPr>
+        <w:spacing w:after="80"/>
+      </w:pPr>
+      <w:r>
+        <w:rPr>
+          <w:b w:val="0"/>
+          <w:sz w:val="18"/>
+        </w:rPr>
+        <w:t>Assumes 4,224 attempts/year per architecture, each completed in full. Volume and duration assumptions come from Arm64; x64 is an equal-workload price comparison, not an independently validated forecast. The 16-vCPU model rounds up to 183 billed minutes; 32-vCPU to 136. Neither larger runner has been measured. Annual figures use the rounded 4,224 rate, so differ slightly from the original model.</w:t>
       </w:r>
     </w:p>
     <w:p>
+      <w:pPr>
+        <w:spacing w:after="80"/>
+      </w:pPr>
       <w:r>
         <w:rPr>
           <w:b w:val="0"/>
+          <w:sz w:val="18"/>
         </w:rPr>
-        <w:t>Two sampled weeks annualize to about 4,224 MSVC Arm64 distribution attempts. Central planning requires roughly 406,662-573,459 occupied runner-minutes/year and $39,986-$56,292 compute, depending on cancellation accounting. Full-attempt demand exceeds one machine's capacity; plan two available runner slots rather than one sole production machine. Adverse cases cost about $59,000-$103,000/year. Ordinary and other-platform CI stays elsewhere; storage, plan fees, tax and operations are excluded. No paid runner has been tested or provisioned. [4]</w:t>
+        <w:t>With historical cancellations, the 32-vCPU central budget is about $40k-$56k/year for Arm64 and $66k-$93k for identical occupied time on x64. Arm64's original model needs 406,662-573,459 occupied minutes/year; full-attempt demand exceeds one machine's capacity. Provide overflow; keep ordinary CI elsewhere. These are total compute costs, not increases over today's bill; storage, plan fees and tax are excluded.</w:t>
       </w:r>
     </w:p>
     <w:p>
@@ -1635,13 +2029,357 @@
       </w:r>
     </w:p>
     <w:p>
+      <w:pPr>
+        <w:spacing w:after="80"/>
+      </w:pPr>
       <w:r>
         <w:rPr>
           <w:b w:val="0"/>
+          <w:sz w:val="18"/>
         </w:rPr>
-        <w:t>If adopting projects collectively spend 10 million eligible Windows compilation minutes/year (80% x64, 20% Arm64), and IronRDP's gains transfer, the estimated saving is 2.22 million runner-minutes/year, worth about $46,171 at current paid four-vCPU list rates ($0.022 x64; $0.014 Arm64). At 100 million baseline minutes, the corresponding figures are 22.15 million minutes and $461,715/year. These are gross downstream equivalents, before upstream production cost. [5]</w:t>
+        <w:t>Scenario: 10 million eligible compilation minutes/year across adopting projects, 80% x64 / 20% Arm64, with IronRDP's gains transferring. Dollar equivalents use paid four-vCPU Windows rates: $0.022 x64 / $0.014 Arm64, not the larger compiler-production rates above. [5]</w:t>
       </w:r>
     </w:p>
+    <w:tbl>
+      <w:tblPr>
+        <w:tblStyle w:val="TableGrid"/>
+        <w:tblW w:type="auto" w:w="0"/>
+        <w:jc w:val="center"/>
+        <w:tblLayout w:type="fixed"/>
+        <w:tblLook w:firstColumn="1" w:firstRow="1" w:lastColumn="0" w:lastRow="0" w:noHBand="0" w:noVBand="1" w:val="04A0"/>
+      </w:tblPr>
+      <w:tblGrid>
+        <w:gridCol w:w="2509"/>
+        <w:gridCol w:w="2509"/>
+        <w:gridCol w:w="2509"/>
+        <w:gridCol w:w="2509"/>
+      </w:tblGrid>
+      <w:tr>
+        <w:trPr>
+          <w:tblHeader/>
+          <w:cantSplit/>
+        </w:trPr>
+        <w:tc>
+          <w:tcPr>
+            <w:tcW w:type="dxa" w:w="1800"/>
+            <w:shd w:fill="17365D"/>
+            <w:vAlign w:val="center"/>
+          </w:tcPr>
+          <w:p>
+            <w:pPr>
+              <w:spacing w:before="60" w:after="60" w:line="240" w:lineRule="auto"/>
+            </w:pPr>
+            <w:r>
+              <w:rPr>
+                <w:b/>
+                <w:color w:val="FFFFFF"/>
+                <w:sz w:val="19"/>
+              </w:rPr>
+              <w:t>Architecture</w:t>
+            </w:r>
+          </w:p>
+        </w:tc>
+        <w:tc>
+          <w:tcPr>
+            <w:tcW w:type="dxa" w:w="2736"/>
+            <w:shd w:fill="17365D"/>
+            <w:vAlign w:val="center"/>
+          </w:tcPr>
+          <w:p>
+            <w:pPr>
+              <w:spacing w:before="60" w:after="60" w:line="240" w:lineRule="auto"/>
+              <w:jc w:val="center"/>
+            </w:pPr>
+            <w:r>
+              <w:rPr>
+                <w:b/>
+                <w:color w:val="FFFFFF"/>
+                <w:sz w:val="19"/>
+              </w:rPr>
+              <w:t>Baseline min/year</w:t>
+            </w:r>
+          </w:p>
+        </w:tc>
+        <w:tc>
+          <w:tcPr>
+            <w:tcW w:type="dxa" w:w="2664"/>
+            <w:shd w:fill="17365D"/>
+            <w:vAlign w:val="center"/>
+          </w:tcPr>
+          <w:p>
+            <w:pPr>
+              <w:spacing w:before="60" w:after="60" w:line="240" w:lineRule="auto"/>
+              <w:jc w:val="center"/>
+            </w:pPr>
+            <w:r>
+              <w:rPr>
+                <w:b/>
+                <w:color w:val="FFFFFF"/>
+                <w:sz w:val="19"/>
+              </w:rPr>
+              <w:t>Saved min/year</w:t>
+            </w:r>
+          </w:p>
+        </w:tc>
+        <w:tc>
+          <w:tcPr>
+            <w:tcW w:type="dxa" w:w="2837"/>
+            <w:shd w:fill="17365D"/>
+            <w:vAlign w:val="center"/>
+          </w:tcPr>
+          <w:p>
+            <w:pPr>
+              <w:spacing w:before="60" w:after="60" w:line="240" w:lineRule="auto"/>
+              <w:jc w:val="center"/>
+            </w:pPr>
+            <w:r>
+              <w:rPr>
+                <w:b/>
+                <w:color w:val="FFFFFF"/>
+                <w:sz w:val="19"/>
+              </w:rPr>
+              <w:t>Gross $/year saved</w:t>
+            </w:r>
+          </w:p>
+        </w:tc>
+      </w:tr>
+      <w:tr>
+        <w:trPr>
+          <w:cantSplit/>
+        </w:trPr>
+        <w:tc>
+          <w:tcPr>
+            <w:tcW w:type="dxa" w:w="1800"/>
+            <w:shd w:fill="EEF3F8"/>
+            <w:vAlign w:val="center"/>
+          </w:tcPr>
+          <w:p>
+            <w:pPr>
+              <w:spacing w:before="60" w:after="60" w:line="240" w:lineRule="auto"/>
+            </w:pPr>
+            <w:r>
+              <w:rPr>
+                <w:sz w:val="19"/>
+              </w:rPr>
+              <w:t>x64</w:t>
+            </w:r>
+          </w:p>
+        </w:tc>
+        <w:tc>
+          <w:tcPr>
+            <w:tcW w:type="dxa" w:w="2736"/>
+            <w:shd w:fill="EEF3F8"/>
+            <w:vAlign w:val="center"/>
+          </w:tcPr>
+          <w:p>
+            <w:pPr>
+              <w:spacing w:before="60" w:after="60" w:line="240" w:lineRule="auto"/>
+              <w:jc w:val="center"/>
+            </w:pPr>
+            <w:r>
+              <w:rPr>
+                <w:sz w:val="19"/>
+              </w:rPr>
+              <w:t>8,000,000</w:t>
+            </w:r>
+          </w:p>
+        </w:tc>
+        <w:tc>
+          <w:tcPr>
+            <w:tcW w:type="dxa" w:w="2664"/>
+            <w:shd w:fill="EEF3F8"/>
+            <w:vAlign w:val="center"/>
+          </w:tcPr>
+          <w:p>
+            <w:pPr>
+              <w:spacing w:before="60" w:after="60" w:line="240" w:lineRule="auto"/>
+              <w:jc w:val="center"/>
+            </w:pPr>
+            <w:r>
+              <w:rPr>
+                <w:sz w:val="19"/>
+              </w:rPr>
+              <w:t>1,894,869</w:t>
+            </w:r>
+          </w:p>
+        </w:tc>
+        <w:tc>
+          <w:tcPr>
+            <w:tcW w:type="dxa" w:w="2837"/>
+            <w:shd w:fill="EEF3F8"/>
+            <w:vAlign w:val="center"/>
+          </w:tcPr>
+          <w:p>
+            <w:pPr>
+              <w:spacing w:before="60" w:after="60" w:line="240" w:lineRule="auto"/>
+              <w:jc w:val="center"/>
+            </w:pPr>
+            <w:r>
+              <w:rPr>
+                <w:sz w:val="19"/>
+              </w:rPr>
+              <w:t>$41,687</w:t>
+            </w:r>
+          </w:p>
+        </w:tc>
+      </w:tr>
+      <w:tr>
+        <w:trPr>
+          <w:cantSplit/>
+        </w:trPr>
+        <w:tc>
+          <w:tcPr>
+            <w:tcW w:type="dxa" w:w="1800"/>
+            <w:vAlign w:val="center"/>
+          </w:tcPr>
+          <w:p>
+            <w:pPr>
+              <w:spacing w:before="60" w:after="60" w:line="240" w:lineRule="auto"/>
+            </w:pPr>
+            <w:r>
+              <w:rPr>
+                <w:sz w:val="19"/>
+              </w:rPr>
+              <w:t>Arm64</w:t>
+            </w:r>
+          </w:p>
+        </w:tc>
+        <w:tc>
+          <w:tcPr>
+            <w:tcW w:type="dxa" w:w="2736"/>
+            <w:vAlign w:val="center"/>
+          </w:tcPr>
+          <w:p>
+            <w:pPr>
+              <w:spacing w:before="60" w:after="60" w:line="240" w:lineRule="auto"/>
+              <w:jc w:val="center"/>
+            </w:pPr>
+            <w:r>
+              <w:rPr>
+                <w:sz w:val="19"/>
+              </w:rPr>
+              <w:t>2,000,000</w:t>
+            </w:r>
+          </w:p>
+        </w:tc>
+        <w:tc>
+          <w:tcPr>
+            <w:tcW w:type="dxa" w:w="2664"/>
+            <w:vAlign w:val="center"/>
+          </w:tcPr>
+          <w:p>
+            <w:pPr>
+              <w:spacing w:before="60" w:after="60" w:line="240" w:lineRule="auto"/>
+              <w:jc w:val="center"/>
+            </w:pPr>
+            <w:r>
+              <w:rPr>
+                <w:sz w:val="19"/>
+              </w:rPr>
+              <w:t>320,311</w:t>
+            </w:r>
+          </w:p>
+        </w:tc>
+        <w:tc>
+          <w:tcPr>
+            <w:tcW w:type="dxa" w:w="2837"/>
+            <w:vAlign w:val="center"/>
+          </w:tcPr>
+          <w:p>
+            <w:pPr>
+              <w:spacing w:before="60" w:after="60" w:line="240" w:lineRule="auto"/>
+              <w:jc w:val="center"/>
+            </w:pPr>
+            <w:r>
+              <w:rPr>
+                <w:sz w:val="19"/>
+              </w:rPr>
+              <w:t>$4,484</w:t>
+            </w:r>
+          </w:p>
+        </w:tc>
+      </w:tr>
+      <w:tr>
+        <w:trPr>
+          <w:cantSplit/>
+        </w:trPr>
+        <w:tc>
+          <w:tcPr>
+            <w:tcW w:type="dxa" w:w="1800"/>
+            <w:shd w:fill="EEF3F8"/>
+            <w:vAlign w:val="center"/>
+          </w:tcPr>
+          <w:p>
+            <w:pPr>
+              <w:spacing w:before="60" w:after="60" w:line="240" w:lineRule="auto"/>
+            </w:pPr>
+            <w:r>
+              <w:rPr>
+                <w:sz w:val="19"/>
+              </w:rPr>
+              <w:t>Total</w:t>
+            </w:r>
+          </w:p>
+        </w:tc>
+        <w:tc>
+          <w:tcPr>
+            <w:tcW w:type="dxa" w:w="2736"/>
+            <w:shd w:fill="EEF3F8"/>
+            <w:vAlign w:val="center"/>
+          </w:tcPr>
+          <w:p>
+            <w:pPr>
+              <w:spacing w:before="60" w:after="60" w:line="240" w:lineRule="auto"/>
+              <w:jc w:val="center"/>
+            </w:pPr>
+            <w:r>
+              <w:rPr>
+                <w:sz w:val="19"/>
+              </w:rPr>
+              <w:t>10,000,000</w:t>
+            </w:r>
+          </w:p>
+        </w:tc>
+        <w:tc>
+          <w:tcPr>
+            <w:tcW w:type="dxa" w:w="2664"/>
+            <w:shd w:fill="EEF3F8"/>
+            <w:vAlign w:val="center"/>
+          </w:tcPr>
+          <w:p>
+            <w:pPr>
+              <w:spacing w:before="60" w:after="60" w:line="240" w:lineRule="auto"/>
+              <w:jc w:val="center"/>
+            </w:pPr>
+            <w:r>
+              <w:rPr>
+                <w:sz w:val="19"/>
+              </w:rPr>
+              <w:t>2,215,179</w:t>
+            </w:r>
+          </w:p>
+        </w:tc>
+        <w:tc>
+          <w:tcPr>
+            <w:tcW w:type="dxa" w:w="2837"/>
+            <w:shd w:fill="EEF3F8"/>
+            <w:vAlign w:val="center"/>
+          </w:tcPr>
+          <w:p>
+            <w:pPr>
+              <w:spacing w:before="60" w:after="60" w:line="240" w:lineRule="auto"/>
+              <w:jc w:val="center"/>
+            </w:pPr>
+            <w:r>
+              <w:rPr>
+                <w:sz w:val="19"/>
+              </w:rPr>
+              <w:t>$46,171</w:t>
+            </w:r>
+          </w:p>
+        </w:tc>
+      </w:tr>
+    </w:tbl>
     <w:p>
       <w:pPr>
         <w:spacing w:after="80"/>
@@ -1651,7 +2389,7 @@
           <w:b w:val="0"/>
           <w:sz w:val="18"/>
         </w:rPr>
-        <w:t>No GitHub-wide Windows Rust workload volume or adoption rate was measured. Actual savings are Mx64 x 23.7% + MArm64 x 16.0%, where M covers only affected compile time on adopting projects. Warm/incremental builds may differ; whole-job critical paths and minute rounding limit invoice savings. Public standard runners are free, so saved minutes there are capacity, not customer cash savings.</w:t>
+        <w:t>At 100 million baseline minutes with the same mix: 22.15 million minutes / $461,715 gross savings. No global workload or adoption volume was measured; these are scenarios, before upstream production costs. Savings scale as Mx64 x 23.7% + MArm64 x 16.0% for affected compile minutes. Warm builds, job critical paths and billing rounding may reduce savings. Public standard runners are free: saved time there is capacity, not customer cash.</w:t>
       </w:r>
     </w:p>
     <w:p>
@@ -1815,7 +2553,7 @@
           <w:b w:val="0"/>
           <w:sz w:val="17"/>
         </w:rPr>
-        <w:t xml:space="preserve">[5] Official reference, pricing checked 2 October 2026: </w:t>
+        <w:t xml:space="preserve">[5] Official reference, pricing checked 7 October 2026: </w:t>
       </w:r>
       <w:hyperlink r:id="rId17">
         <w:r>
@@ -1849,7 +2587,7 @@
       <w:rPr>
         <w:sz w:val="16"/>
       </w:rPr>
-      <w:t xml:space="preserve">Windows Rust investigation | 2 October 2026 | </w:t>
+      <w:t xml:space="preserve">Windows Rust investigation | Updated 7 October 2026 | </w:t>
     </w:r>
     <w:fldSimple w:instr="PAGE"/>
   </w:p>

</xml_diff>